<commit_message>
docs: align Kotlin version notes with release build
</commit_message>
<xml_diff>
--- a/docs/docx/Tahap-3-Implementasi.docx
+++ b/docs/docx/Tahap-3-Implementasi.docx
@@ -4400,7 +4400,7 @@
                 <w:b w:val="0"/>
                 <w:sz w:val="19"/>
               </w:rPr>
-              <w:t>AGP 8.11.1, Kotlin 2.1.0</w:t>
+              <w:t>AGP 8.11.1, Kotlin 2.2.20</w:t>
             </w:r>
           </w:p>
         </w:tc>
@@ -4417,7 +4417,7 @@
                 <w:b w:val="0"/>
                 <w:sz w:val="19"/>
               </w:rPr>
-              <w:t>Kompatibel dengan Gradle 8.14 dan Java 17–20</w:t>
+              <w:t>Kompatibel dengan Gradle 8.14 dan Java 17-20</w:t>
             </w:r>
           </w:p>
         </w:tc>

</xml_diff>